<commit_message>
Fit resignation letter to A4 letterhead
</commit_message>
<xml_diff>
--- a/backend/templates/GSSG-HR_301-010_Employee_Resignation_Form_.docx
+++ b/backend/templates/GSSG-HR_301-010_Employee_Resignation_Form_.docx
@@ -31,17 +31,17 @@
       <w:tblPr>
         <w:tblStyle w:val="TableGrid"/>
         <w:bidiVisual/>
-        <w:tblW w:w="10922" w:type="dxa"/>
+        <w:tblW w:w="10350" w:type="dxa"/>
         <w:jc w:val="center"/>
         <w:tblLook w:val="04A0" w:firstRow="1" w:lastRow="0" w:firstColumn="1" w:lastColumn="0" w:noHBand="0" w:noVBand="1"/>
       </w:tblPr>
       <w:tblGrid>
-        <w:gridCol w:w="2350"/>
-        <w:gridCol w:w="1860"/>
-        <w:gridCol w:w="1530"/>
-        <w:gridCol w:w="1350"/>
-        <w:gridCol w:w="1800"/>
-        <w:gridCol w:w="2032"/>
+        <w:gridCol w:w="2227"/>
+        <w:gridCol w:w="1763"/>
+        <w:gridCol w:w="1450"/>
+        <w:gridCol w:w="1279"/>
+        <w:gridCol w:w="1706"/>
+        <w:gridCol w:w="1925"/>
       </w:tblGrid>
       <w:tr>
         <w:trPr>
@@ -49,7 +49,7 @@
         </w:trPr>
         <w:tc>
           <w:tcPr>
-            <w:tcW w:w="10922" w:type="dxa"/>
+            <w:tcW w:w="10350" w:type="dxa"/>
             <w:gridSpan w:val="6"/>
             <w:tcBorders>
               <w:top w:val="thinThickSmallGap" w:sz="24" w:space="0" w:color="auto"/>
@@ -94,7 +94,7 @@
         </w:trPr>
         <w:tc>
           <w:tcPr>
-            <w:tcW w:w="2350" w:type="dxa"/>
+            <w:tcW w:w="2227" w:type="dxa"/>
             <w:tcBorders>
               <w:top w:val="thinThickSmallGap" w:sz="24" w:space="0" w:color="auto"/>
               <w:left w:val="thinThickSmallGap" w:sz="24" w:space="0" w:color="auto"/>
@@ -162,7 +162,7 @@
         </w:tc>
         <w:tc>
           <w:tcPr>
-            <w:tcW w:w="1860" w:type="dxa"/>
+            <w:tcW w:w="1763" w:type="dxa"/>
             <w:tcBorders>
               <w:top w:val="thinThickSmallGap" w:sz="24" w:space="0" w:color="auto"/>
             </w:tcBorders>
@@ -193,7 +193,7 @@
         </w:tc>
         <w:tc>
           <w:tcPr>
-            <w:tcW w:w="1530" w:type="dxa"/>
+            <w:tcW w:w="1450" w:type="dxa"/>
             <w:tcBorders>
               <w:top w:val="thinThickSmallGap" w:sz="24" w:space="0" w:color="auto"/>
             </w:tcBorders>
@@ -240,7 +240,7 @@
         </w:tc>
         <w:tc>
           <w:tcPr>
-            <w:tcW w:w="1350" w:type="dxa"/>
+            <w:tcW w:w="1279" w:type="dxa"/>
             <w:tcBorders>
               <w:top w:val="thinThickSmallGap" w:sz="24" w:space="0" w:color="auto"/>
             </w:tcBorders>
@@ -277,7 +277,7 @@
         </w:tc>
         <w:tc>
           <w:tcPr>
-            <w:tcW w:w="1800" w:type="dxa"/>
+            <w:tcW w:w="1706" w:type="dxa"/>
             <w:tcBorders>
               <w:top w:val="thinThickSmallGap" w:sz="24" w:space="0" w:color="auto"/>
             </w:tcBorders>
@@ -324,7 +324,7 @@
         </w:tc>
         <w:tc>
           <w:tcPr>
-            <w:tcW w:w="2032" w:type="dxa"/>
+            <w:tcW w:w="1925" w:type="dxa"/>
             <w:tcBorders>
               <w:top w:val="thinThickSmallGap" w:sz="24" w:space="0" w:color="auto"/>
               <w:right w:val="thinThickSmallGap" w:sz="24" w:space="0" w:color="auto"/>
@@ -374,7 +374,7 @@
         </w:trPr>
         <w:tc>
           <w:tcPr>
-            <w:tcW w:w="2350" w:type="dxa"/>
+            <w:tcW w:w="2227" w:type="dxa"/>
             <w:tcBorders>
               <w:left w:val="thinThickSmallGap" w:sz="24" w:space="0" w:color="auto"/>
             </w:tcBorders>
@@ -421,7 +421,7 @@
         </w:tc>
         <w:tc>
           <w:tcPr>
-            <w:tcW w:w="8572" w:type="dxa"/>
+            <w:tcW w:w="8123" w:type="dxa"/>
             <w:gridSpan w:val="5"/>
             <w:tcBorders>
               <w:right w:val="thinThickSmallGap" w:sz="24" w:space="0" w:color="auto"/>
@@ -464,7 +464,7 @@
         </w:trPr>
         <w:tc>
           <w:tcPr>
-            <w:tcW w:w="2350" w:type="dxa"/>
+            <w:tcW w:w="2227" w:type="dxa"/>
             <w:tcBorders>
               <w:left w:val="thinThickSmallGap" w:sz="24" w:space="0" w:color="auto"/>
               <w:bottom w:val="thinThickSmallGap" w:sz="24" w:space="0" w:color="auto"/>
@@ -512,7 +512,7 @@
         </w:tc>
         <w:tc>
           <w:tcPr>
-            <w:tcW w:w="1860" w:type="dxa"/>
+            <w:tcW w:w="1763" w:type="dxa"/>
             <w:tcBorders>
               <w:bottom w:val="thinThickSmallGap" w:sz="24" w:space="0" w:color="auto"/>
             </w:tcBorders>
@@ -538,7 +538,7 @@
         </w:tc>
         <w:tc>
           <w:tcPr>
-            <w:tcW w:w="1530" w:type="dxa"/>
+            <w:tcW w:w="1450" w:type="dxa"/>
             <w:tcBorders>
               <w:bottom w:val="thinThickSmallGap" w:sz="24" w:space="0" w:color="auto"/>
             </w:tcBorders>
@@ -585,7 +585,7 @@
         </w:tc>
         <w:tc>
           <w:tcPr>
-            <w:tcW w:w="1350" w:type="dxa"/>
+            <w:tcW w:w="1279" w:type="dxa"/>
             <w:tcBorders>
               <w:bottom w:val="thinThickSmallGap" w:sz="24" w:space="0" w:color="auto"/>
             </w:tcBorders>
@@ -618,7 +618,7 @@
         </w:tc>
         <w:tc>
           <w:tcPr>
-            <w:tcW w:w="1800" w:type="dxa"/>
+            <w:tcW w:w="1706" w:type="dxa"/>
             <w:tcBorders>
               <w:bottom w:val="thinThickSmallGap" w:sz="24" w:space="0" w:color="auto"/>
             </w:tcBorders>
@@ -665,7 +665,7 @@
         </w:tc>
         <w:tc>
           <w:tcPr>
-            <w:tcW w:w="2032" w:type="dxa"/>
+            <w:tcW w:w="1925" w:type="dxa"/>
             <w:tcBorders>
               <w:bottom w:val="thinThickSmallGap" w:sz="24" w:space="0" w:color="auto"/>
               <w:right w:val="thinThickSmallGap" w:sz="24" w:space="0" w:color="auto"/>
@@ -733,12 +733,12 @@
       <w:tblPr>
         <w:tblStyle w:val="TableGrid"/>
         <w:bidiVisual/>
-        <w:tblW w:w="10912" w:type="dxa"/>
+        <w:tblW w:w="10350" w:type="dxa"/>
         <w:jc w:val="center"/>
         <w:tblLook w:val="04A0" w:firstRow="1" w:lastRow="0" w:firstColumn="1" w:lastColumn="0" w:noHBand="0" w:noVBand="1"/>
       </w:tblPr>
       <w:tblGrid>
-        <w:gridCol w:w="10912"/>
+        <w:gridCol w:w="10350"/>
       </w:tblGrid>
       <w:tr>
         <w:trPr>
@@ -747,7 +747,7 @@
         </w:trPr>
         <w:tc>
           <w:tcPr>
-            <w:tcW w:w="10912" w:type="dxa"/>
+            <w:tcW w:w="10350" w:type="dxa"/>
             <w:tcBorders>
               <w:top w:val="thinThickSmallGap" w:sz="24" w:space="0" w:color="auto"/>
               <w:left w:val="thinThickSmallGap" w:sz="24" w:space="0" w:color="auto"/>
@@ -1150,15 +1150,15 @@
       <w:tblPr>
         <w:tblStyle w:val="TableGrid"/>
         <w:bidiVisual/>
-        <w:tblW w:w="10912" w:type="dxa"/>
+        <w:tblW w:w="10350" w:type="dxa"/>
         <w:jc w:val="center"/>
         <w:tblLook w:val="04A0" w:firstRow="1" w:lastRow="0" w:firstColumn="1" w:lastColumn="0" w:noHBand="0" w:noVBand="1"/>
       </w:tblPr>
       <w:tblGrid>
-        <w:gridCol w:w="3227"/>
-        <w:gridCol w:w="4050"/>
-        <w:gridCol w:w="1980"/>
-        <w:gridCol w:w="1655"/>
+        <w:gridCol w:w="3061"/>
+        <w:gridCol w:w="3841"/>
+        <w:gridCol w:w="1878"/>
+        <w:gridCol w:w="1570"/>
       </w:tblGrid>
       <w:tr>
         <w:trPr>
@@ -1167,7 +1167,7 @@
         </w:trPr>
         <w:tc>
           <w:tcPr>
-            <w:tcW w:w="3227" w:type="dxa"/>
+            <w:tcW w:w="3061" w:type="dxa"/>
             <w:tcBorders>
               <w:top w:val="thinThickSmallGap" w:sz="24" w:space="0" w:color="auto"/>
               <w:left w:val="thinThickSmallGap" w:sz="24" w:space="0" w:color="auto"/>
@@ -1203,7 +1203,7 @@
         </w:tc>
         <w:tc>
           <w:tcPr>
-            <w:tcW w:w="7685" w:type="dxa"/>
+            <w:tcW w:w="7289" w:type="dxa"/>
             <w:gridSpan w:val="3"/>
             <w:tcBorders>
               <w:top w:val="thinThickSmallGap" w:sz="24" w:space="0" w:color="auto"/>
@@ -1244,7 +1244,7 @@
         </w:trPr>
         <w:tc>
           <w:tcPr>
-            <w:tcW w:w="3227" w:type="dxa"/>
+            <w:tcW w:w="3061" w:type="dxa"/>
             <w:tcBorders>
               <w:top w:val="thinThickSmallGap" w:sz="24" w:space="0" w:color="auto"/>
               <w:left w:val="thinThickSmallGap" w:sz="24" w:space="0" w:color="auto"/>
@@ -1300,7 +1300,7 @@
         </w:tc>
         <w:tc>
           <w:tcPr>
-            <w:tcW w:w="4050" w:type="dxa"/>
+            <w:tcW w:w="3841" w:type="dxa"/>
             <w:tcBorders>
               <w:top w:val="thinThickSmallGap" w:sz="24" w:space="0" w:color="auto"/>
               <w:bottom w:val="thinThickSmallGap" w:sz="24" w:space="0" w:color="auto"/>
@@ -1333,7 +1333,7 @@
         </w:tc>
         <w:tc>
           <w:tcPr>
-            <w:tcW w:w="1980" w:type="dxa"/>
+            <w:tcW w:w="1878" w:type="dxa"/>
             <w:tcBorders>
               <w:top w:val="thinThickSmallGap" w:sz="24" w:space="0" w:color="auto"/>
               <w:bottom w:val="thinThickSmallGap" w:sz="24" w:space="0" w:color="auto"/>
@@ -1367,7 +1367,7 @@
         </w:tc>
         <w:tc>
           <w:tcPr>
-            <w:tcW w:w="1655" w:type="dxa"/>
+            <w:tcW w:w="1570" w:type="dxa"/>
             <w:tcBorders>
               <w:top w:val="thinThickSmallGap" w:sz="24" w:space="0" w:color="auto"/>
               <w:bottom w:val="thinThickSmallGap" w:sz="24" w:space="0" w:color="auto"/>
@@ -1407,7 +1407,7 @@
         </w:trPr>
         <w:tc>
           <w:tcPr>
-            <w:tcW w:w="10912" w:type="dxa"/>
+            <w:tcW w:w="10350" w:type="dxa"/>
             <w:gridSpan w:val="4"/>
             <w:tcBorders>
               <w:top w:val="thinThickSmallGap" w:sz="24" w:space="0" w:color="auto"/>
@@ -1579,7 +1579,7 @@
       <w:footerReference w:type="default" r:id="rId20"/>
       <w:headerReference w:type="first" r:id="rId19"/>
       <w:footerReference w:type="first" r:id="rId18"/>
-      <w:pgSz w:w="12240" w:h="15840" w:code="1"/>
+      <w:pgSz w:w="11906" w:h="16838"/>
       <w:pgMar w:top="900" w:right="746" w:bottom="1440" w:left="810" w:header="360" w:footer="84" w:gutter="0"/>
       <w:cols w:space="708"/>
       <w:titlePg/>
@@ -6768,12 +6768,18 @@
     <w:rPrDefault>
       <w:rPr>
         <w:rFonts w:asciiTheme="minorHAnsi" w:eastAsiaTheme="minorHAnsi" w:hAnsiTheme="minorHAnsi" w:cstheme="minorBidi"/>
-        <w:sz w:val="24"/>
-        <w:szCs w:val="24"/>
-        <w:lang w:val="en-ZA" w:eastAsia="en-US" w:bidi="ar-SA"/>
+        <w:kern w:val="2"/>
+        <w:sz w:val="22"/>
+        <w:szCs w:val="22"/>
+        <w:lang w:val="en-AE" w:eastAsia="en-US" w:bidi="ar-SA"/>
+        <w14:ligatures w14:val="standardContextual"/>
       </w:rPr>
     </w:rPrDefault>
-    <w:pPrDefault/>
+    <w:pPrDefault>
+      <w:pPr>
+        <w:spacing w:after="160" w:line="259" w:lineRule="auto"/>
+      </w:pPr>
+    </w:pPrDefault>
   </w:docDefaults>
   <w:latentStyles w:defLockedState="0" w:defUIPriority="99" w:defSemiHidden="0" w:defUnhideWhenUsed="0" w:defQFormat="0" w:count="376">
     <w:lsdException w:name="Normal" w:uiPriority="0" w:qFormat="1"/>
@@ -7156,8 +7162,16 @@
   <w:style w:type="paragraph" w:default="1" w:styleId="Normal">
     <w:name w:val="Normal"/>
     <w:qFormat/>
+    <w:rsid w:val="00A37CB4"/>
+    <w:pPr>
+      <w:spacing w:after="0" w:line="240" w:lineRule="auto"/>
+    </w:pPr>
     <w:rPr>
+      <w:kern w:val="0"/>
+      <w:sz w:val="24"/>
+      <w:szCs w:val="24"/>
       <w:lang w:val="en-GB"/>
+      <w14:ligatures w14:val="none"/>
     </w:rPr>
   </w:style>
   <w:style w:type="character" w:default="1" w:styleId="DefaultParagraphFont">
@@ -7217,13 +7231,20 @@
     <w:link w:val="FooterChar"/>
     <w:uiPriority w:val="99"/>
     <w:unhideWhenUsed/>
-    <w:rsid w:val="007D1921"/>
+    <w:rsid w:val="00DE5DC2"/>
     <w:pPr>
       <w:tabs>
         <w:tab w:val="center" w:pos="4513"/>
         <w:tab w:val="right" w:pos="9026"/>
       </w:tabs>
     </w:pPr>
+    <w:rPr>
+      <w:kern w:val="2"/>
+      <w:sz w:val="22"/>
+      <w:szCs w:val="22"/>
+      <w:lang w:val="en-AE"/>
+      <w14:ligatures w14:val="standardContextual"/>
+    </w:rPr>
   </w:style>
   <w:style w:type="character" w:customStyle="1" w:styleId="FooterChar">
     <w:name w:val="Footer Char"/>

</xml_diff>

<commit_message>
Remove cell shading from resignation letter
</commit_message>
<xml_diff>
--- a/backend/templates/GSSG-HR_301-010_Employee_Resignation_Form_.docx
+++ b/backend/templates/GSSG-HR_301-010_Employee_Resignation_Form_.docx
@@ -56,7 +56,6 @@
               <w:left w:val="thinThickSmallGap" w:sz="24" w:space="0" w:color="auto"/>
               <w:right w:val="thinThickSmallGap" w:sz="24" w:space="0" w:color="auto"/>
             </w:tcBorders>
-            <w:shd w:val="clear" w:color="auto" w:fill="C00000"/>
           </w:tcPr>
           <w:p>
             <w:pPr>
@@ -99,7 +98,6 @@
               <w:top w:val="thinThickSmallGap" w:sz="24" w:space="0" w:color="auto"/>
               <w:left w:val="thinThickSmallGap" w:sz="24" w:space="0" w:color="auto"/>
             </w:tcBorders>
-            <w:shd w:val="clear" w:color="auto" w:fill="8EAADB" w:themeFill="accent1" w:themeFillTint="99"/>
           </w:tcPr>
           <w:p>
             <w:pPr>
@@ -166,7 +164,6 @@
             <w:tcBorders>
               <w:top w:val="thinThickSmallGap" w:sz="24" w:space="0" w:color="auto"/>
             </w:tcBorders>
-            <w:shd w:val="clear" w:color="auto" w:fill="FFFFFF" w:themeFill="background1"/>
           </w:tcPr>
           <w:p>
             <w:pPr>
@@ -197,7 +194,6 @@
             <w:tcBorders>
               <w:top w:val="thinThickSmallGap" w:sz="24" w:space="0" w:color="auto"/>
             </w:tcBorders>
-            <w:shd w:val="clear" w:color="auto" w:fill="8EAADB" w:themeFill="accent1" w:themeFillTint="99"/>
           </w:tcPr>
           <w:p>
             <w:pPr>
@@ -244,7 +240,6 @@
             <w:tcBorders>
               <w:top w:val="thinThickSmallGap" w:sz="24" w:space="0" w:color="auto"/>
             </w:tcBorders>
-            <w:shd w:val="clear" w:color="auto" w:fill="FFFFFF" w:themeFill="background1"/>
           </w:tcPr>
           <w:p>
             <w:pPr>
@@ -281,7 +276,6 @@
             <w:tcBorders>
               <w:top w:val="thinThickSmallGap" w:sz="24" w:space="0" w:color="auto"/>
             </w:tcBorders>
-            <w:shd w:val="clear" w:color="auto" w:fill="8EAADB" w:themeFill="accent1" w:themeFillTint="99"/>
           </w:tcPr>
           <w:p>
             <w:pPr>
@@ -329,7 +323,6 @@
               <w:top w:val="thinThickSmallGap" w:sz="24" w:space="0" w:color="auto"/>
               <w:right w:val="thinThickSmallGap" w:sz="24" w:space="0" w:color="auto"/>
             </w:tcBorders>
-            <w:shd w:val="clear" w:color="auto" w:fill="FFFFFF" w:themeFill="background1"/>
           </w:tcPr>
           <w:p>
             <w:pPr>
@@ -378,7 +371,6 @@
             <w:tcBorders>
               <w:left w:val="thinThickSmallGap" w:sz="24" w:space="0" w:color="auto"/>
             </w:tcBorders>
-            <w:shd w:val="clear" w:color="auto" w:fill="8EAADB" w:themeFill="accent1" w:themeFillTint="99"/>
           </w:tcPr>
           <w:p>
             <w:pPr>
@@ -426,7 +418,6 @@
             <w:tcBorders>
               <w:right w:val="thinThickSmallGap" w:sz="24" w:space="0" w:color="auto"/>
             </w:tcBorders>
-            <w:shd w:val="clear" w:color="auto" w:fill="FFFFFF" w:themeFill="background1"/>
           </w:tcPr>
           <w:p>
             <w:pPr>
@@ -469,7 +460,6 @@
               <w:left w:val="thinThickSmallGap" w:sz="24" w:space="0" w:color="auto"/>
               <w:bottom w:val="thinThickSmallGap" w:sz="24" w:space="0" w:color="auto"/>
             </w:tcBorders>
-            <w:shd w:val="clear" w:color="auto" w:fill="8EAADB" w:themeFill="accent1" w:themeFillTint="99"/>
           </w:tcPr>
           <w:p>
             <w:pPr>
@@ -516,7 +506,6 @@
             <w:tcBorders>
               <w:bottom w:val="thinThickSmallGap" w:sz="24" w:space="0" w:color="auto"/>
             </w:tcBorders>
-            <w:shd w:val="clear" w:color="auto" w:fill="FFFFFF" w:themeFill="background1"/>
           </w:tcPr>
           <w:p>
             <w:pPr>
@@ -542,7 +531,6 @@
             <w:tcBorders>
               <w:bottom w:val="thinThickSmallGap" w:sz="24" w:space="0" w:color="auto"/>
             </w:tcBorders>
-            <w:shd w:val="clear" w:color="auto" w:fill="8EAADB" w:themeFill="accent1" w:themeFillTint="99"/>
           </w:tcPr>
           <w:p>
             <w:pPr>
@@ -589,7 +577,6 @@
             <w:tcBorders>
               <w:bottom w:val="thinThickSmallGap" w:sz="24" w:space="0" w:color="auto"/>
             </w:tcBorders>
-            <w:shd w:val="clear" w:color="auto" w:fill="FFFFFF" w:themeFill="background1"/>
           </w:tcPr>
           <w:p>
             <w:pPr>
@@ -622,7 +609,6 @@
             <w:tcBorders>
               <w:bottom w:val="thinThickSmallGap" w:sz="24" w:space="0" w:color="auto"/>
             </w:tcBorders>
-            <w:shd w:val="clear" w:color="auto" w:fill="8EAADB" w:themeFill="accent1" w:themeFillTint="99"/>
           </w:tcPr>
           <w:p>
             <w:pPr>
@@ -670,7 +656,6 @@
               <w:bottom w:val="thinThickSmallGap" w:sz="24" w:space="0" w:color="auto"/>
               <w:right w:val="thinThickSmallGap" w:sz="24" w:space="0" w:color="auto"/>
             </w:tcBorders>
-            <w:shd w:val="clear" w:color="auto" w:fill="FFFFFF" w:themeFill="background1"/>
           </w:tcPr>
           <w:p>
             <w:pPr>
@@ -1173,7 +1158,6 @@
               <w:left w:val="thinThickSmallGap" w:sz="24" w:space="0" w:color="auto"/>
               <w:bottom w:val="thinThickSmallGap" w:sz="24" w:space="0" w:color="auto"/>
             </w:tcBorders>
-            <w:shd w:val="clear" w:color="auto" w:fill="8EAADB" w:themeFill="accent1" w:themeFillTint="99"/>
           </w:tcPr>
           <w:p>
             <w:pPr>
@@ -1210,7 +1194,6 @@
               <w:bottom w:val="thinThickSmallGap" w:sz="24" w:space="0" w:color="auto"/>
               <w:right w:val="thinThickSmallGap" w:sz="24" w:space="0" w:color="auto"/>
             </w:tcBorders>
-            <w:shd w:val="clear" w:color="auto" w:fill="FFFFFF" w:themeFill="background1"/>
           </w:tcPr>
           <w:p>
             <w:pPr>
@@ -1250,7 +1233,6 @@
               <w:left w:val="thinThickSmallGap" w:sz="24" w:space="0" w:color="auto"/>
               <w:bottom w:val="thinThickSmallGap" w:sz="24" w:space="0" w:color="auto"/>
             </w:tcBorders>
-            <w:shd w:val="clear" w:color="auto" w:fill="8EAADB" w:themeFill="accent1" w:themeFillTint="99"/>
           </w:tcPr>
           <w:p>
             <w:pPr>
@@ -1305,7 +1287,6 @@
               <w:top w:val="thinThickSmallGap" w:sz="24" w:space="0" w:color="auto"/>
               <w:bottom w:val="thinThickSmallGap" w:sz="24" w:space="0" w:color="auto"/>
             </w:tcBorders>
-            <w:shd w:val="clear" w:color="auto" w:fill="FFFFFF" w:themeFill="background1"/>
           </w:tcPr>
           <w:p>
             <w:pPr>
@@ -1338,7 +1319,6 @@
               <w:top w:val="thinThickSmallGap" w:sz="24" w:space="0" w:color="auto"/>
               <w:bottom w:val="thinThickSmallGap" w:sz="24" w:space="0" w:color="auto"/>
             </w:tcBorders>
-            <w:shd w:val="clear" w:color="auto" w:fill="8EAADB" w:themeFill="accent1" w:themeFillTint="99"/>
           </w:tcPr>
           <w:p>
             <w:pPr>
@@ -1373,7 +1353,6 @@
               <w:bottom w:val="thinThickSmallGap" w:sz="24" w:space="0" w:color="auto"/>
               <w:right w:val="thinThickSmallGap" w:sz="24" w:space="0" w:color="auto"/>
             </w:tcBorders>
-            <w:shd w:val="clear" w:color="auto" w:fill="FFFFFF" w:themeFill="background1"/>
           </w:tcPr>
           <w:p>
             <w:pPr>
@@ -1414,7 +1393,6 @@
               <w:left w:val="thinThickSmallGap" w:sz="24" w:space="0" w:color="auto"/>
               <w:right w:val="thinThickSmallGap" w:sz="24" w:space="0" w:color="auto"/>
             </w:tcBorders>
-            <w:shd w:val="clear" w:color="auto" w:fill="FFFFFF" w:themeFill="background1"/>
           </w:tcPr>
           <w:p>
             <w:pPr>

</xml_diff>